<commit_message>
Kim12-3-3-Yapay-Zeka-ve-Surdurulebilirlik: gorsel alanlarina Shutter onizlemeleri yerlestirildi (2.3 bicimi)
</commit_message>
<xml_diff>
--- a/Kim12-3-3-Yapay-Zeka-ve-Surdurulebilirlik.docx
+++ b/Kim12-3-3-Yapay-Zeka-ve-Surdurulebilirlik.docx
@@ -39,99 +39,73 @@
         <w:t xml:space="preserve">Telefonunuza “Yarın yağmur yağacak mı?” diye sorduğunuzda sesli asistan birkaç saniye içinde cevap verir. İzlediğiniz bir videonun ardından ilginizi çekebilecek yeni videolar önerilir (Görsel A). Hastanelerde bilgisayar programları doktorların röntgen görüntülerini incelemesine yardımcı olur, bazı şehirlerde trafik ışıkları araç yoğunluğuna göre kendini ayarlar. Kimya laboratuvarlarında bile bilgisayarlar, binlerce olası molekül ya da tepkime koşulu arasından en uygununu seçmeye yardım etmektedir. Peki, bu uygulamalar nasıl “öğrenir”? Enerjiyi, suyu ve ham maddeleri daha verimli kullanmamıza yardım ederek doğayı korumaya mı katkı sağlar, yoksa çalışmaları için gereken elektrik, su ve donanım yeni çevre sorunlarına mı yol açar? Bir uygulamanın yalnızca faydasına ya da yalnızca zararına bakarak doğru bir yargıya ulaşılabilir mi? Bu soruların cevabını bir etkinlik yaparak keşfediniz. Analiz ve Keşif Atölyesi 3.3.’te eleştirel düşüneceksiniz: Yapay zekâ uygulamalarının sürdürülebilirliğe etkilerini sorgulayacak, olası katkılar ve riskler hakkında kanıtlara dayanarak akıl yürütecek, ulaştığınız çıkarımları yansıtacaksınız. Tartışmalarda duygularınızı fark edip ifade edecek, farklı görüşlere nezaketle yaklaşacak, değişen durumlara uyum sağlayarak sorumlu kararlar almayı deneyimleyecek; çevreye ve canlılara duyarlılık, tasarruf ve temizlik değerlerini de destekleyeceksiniz.</w:t>
       </w:r>
     </w:p>
-    <w:tbl>
-      <w:tblPr>
-        <w:tblW w:w="9000" w:type="dxa"/>
+    <w:p>
+      <w:pPr>
         <w:jc w:val="center"/>
-        <w:tblBorders>
-          <w:top w:val="single" w:sz="8" w:space="0" w:color="7F7F7F"/>
-          <w:left w:val="single" w:sz="8" w:space="0" w:color="7F7F7F"/>
-          <w:bottom w:val="single" w:sz="8" w:space="0" w:color="7F7F7F"/>
-          <w:right w:val="single" w:sz="8" w:space="0" w:color="7F7F7F"/>
-        </w:tblBorders>
-      </w:tblPr>
-      <w:tblGrid>
-        <w:gridCol w:w="9000"/>
-      </w:tblGrid>
-      <w:tr>
-        <w:tc>
-          <w:tcPr>
-            <w:tcW w:w="9000" w:type="dxa"/>
-            <w:shd w:val="clear" w:color="auto" w:fill="EDEDED"/>
-          </w:tcPr>
-          <w:p>
-            <w:pPr>
-              <w:jc w:val="both"/>
-              <w:rPr>
-                <w:rFonts w:ascii="Times New Roman" w:hAnsi="Times New Roman" w:cs="Times New Roman"/>
-                <w:lang w:val="tr-TR"/>
-              </w:rPr>
-            </w:pPr>
-            <w:r>
-              <w:rPr>
-                <w:rFonts w:ascii="Times New Roman" w:hAnsi="Times New Roman" w:cs="Times New Roman"/>
-                <w:lang w:val="tr-TR"/>
-              </w:rPr>
-              <w:t xml:space="preserve">GÖRSEL ALANI (Shutterstock)</w:t>
-            </w:r>
-          </w:p>
-          <w:p>
-            <w:pPr>
-              <w:jc w:val="both"/>
-              <w:rPr>
-                <w:rFonts w:ascii="Times New Roman" w:hAnsi="Times New Roman" w:cs="Times New Roman"/>
-                <w:lang w:val="tr-TR"/>
-              </w:rPr>
-            </w:pPr>
-            <w:r>
-              <w:rPr>
-                <w:rFonts w:ascii="Times New Roman" w:hAnsi="Times New Roman" w:cs="Times New Roman"/>
-                <w:lang w:val="tr-TR"/>
-              </w:rPr>
-              <w:t xml:space="preserve">Tarif: Akıllı telefonla sesli komut veren bir genç, telefon ekranında video önerileri; arka planda akıllı bina ve trafik simgeleri (vektörel ya da fotoğraf; marka/logo görünmesin).</w:t>
-            </w:r>
-          </w:p>
-          <w:p>
-            <w:pPr>
-              <w:jc w:val="both"/>
-              <w:rPr>
-                <w:rFonts w:ascii="Times New Roman" w:hAnsi="Times New Roman" w:cs="Times New Roman"/>
-                <w:lang w:val="tr-TR"/>
-              </w:rPr>
-            </w:pPr>
-            <w:r>
-              <w:rPr>
-                <w:rFonts w:ascii="Times New Roman" w:hAnsi="Times New Roman" w:cs="Times New Roman"/>
-                <w:lang w:val="tr-TR"/>
-              </w:rPr>
-              <w:t xml:space="preserve">Shutter ID: 2843947897 (fotoğraf) — Woman talking to AI voice assistant on smartphone</w:t>
-            </w:r>
-          </w:p>
-        </w:tc>
-      </w:tr>
-    </w:tbl>
-    <w:p>
-      <w:pPr>
-        <w:jc w:val="both"/>
-        <w:rPr>
-          <w:rFonts w:ascii="Times New Roman" w:hAnsi="Times New Roman" w:cs="Times New Roman"/>
-          <w:lang w:val="tr-TR"/>
-        </w:rPr>
-      </w:pPr>
+      </w:pPr>
+      <w:r>
+        <w:drawing>
+          <wp:inline xmlns:a="http://schemas.openxmlformats.org/drawingml/2006/main" xmlns:pic="http://schemas.openxmlformats.org/drawingml/2006/picture">
+            <wp:extent cx="3430127" cy="2520000"/>
+            <wp:docPr id="900009" name="Picture 900009"/>
+            <wp:cNvGraphicFramePr>
+              <a:graphicFrameLocks noChangeAspect="1"/>
+            </wp:cNvGraphicFramePr>
+            <a:graphic>
+              <a:graphicData uri="http://schemas.openxmlformats.org/drawingml/2006/picture">
+                <pic:pic>
+                  <pic:nvPicPr>
+                    <pic:cNvPr id="0" name="2843947897_d.jpg"/>
+                    <pic:cNvPicPr/>
+                  </pic:nvPicPr>
+                  <pic:blipFill>
+                    <a:blip r:embed="rId11"/>
+                    <a:stretch>
+                      <a:fillRect/>
+                    </a:stretch>
+                  </pic:blipFill>
+                  <pic:spPr>
+                    <a:xfrm>
+                      <a:off x="0" y="0"/>
+                      <a:ext cx="3430127" cy="2520000"/>
+                    </a:xfrm>
+                    <a:prstGeom prst="rect"/>
+                  </pic:spPr>
+                </pic:pic>
+              </a:graphicData>
+            </a:graphic>
+          </wp:inline>
+        </w:drawing>
+      </w:r>
     </w:p>
     <w:p>
       <w:pPr>
         <w:jc w:val="center"/>
-        <w:rPr>
-          <w:rFonts w:ascii="Times New Roman" w:hAnsi="Times New Roman" w:cs="Times New Roman"/>
-          <w:lang w:val="tr-TR"/>
-        </w:rPr>
       </w:pPr>
       <w:r>
         <w:rPr>
           <w:rFonts w:ascii="Times New Roman" w:hAnsi="Times New Roman" w:cs="Times New Roman"/>
           <w:b/>
           <w:bCs/>
+          <w:highlight w:val="yellow"/>
+          <w:lang w:val="tr-TR"/>
+        </w:rPr>
+        <w:t xml:space="preserve">Shutter id: 2843947897</w:t>
+      </w:r>
+    </w:p>
+    <w:p>
+      <w:pPr>
+        <w:jc w:val="center"/>
+        <w:rPr>
+          <w:rFonts w:ascii="Times New Roman" w:hAnsi="Times New Roman" w:cs="Times New Roman"/>
+          <w:lang w:val="tr-TR"/>
+        </w:rPr>
+      </w:pPr>
+      <w:r>
+        <w:rPr>
+          <w:rFonts w:ascii="Times New Roman" w:hAnsi="Times New Roman" w:cs="Times New Roman"/>
+          <w:b/>
+          <w:bCs/>
           <w:lang w:val="tr-TR"/>
         </w:rPr>
         <w:t xml:space="preserve">Görsel A:</w:t>
@@ -144,85 +118,59 @@
         <w:t xml:space="preserve"> Günlük hayatta yapay zekâ uygulamaları</w:t>
       </w:r>
     </w:p>
-    <w:tbl>
-      <w:tblPr>
-        <w:tblW w:w="9000" w:type="dxa"/>
+    <w:p>
+      <w:pPr>
         <w:jc w:val="center"/>
-        <w:tblBorders>
-          <w:top w:val="single" w:sz="8" w:space="0" w:color="7F7F7F"/>
-          <w:left w:val="single" w:sz="8" w:space="0" w:color="7F7F7F"/>
-          <w:bottom w:val="single" w:sz="8" w:space="0" w:color="7F7F7F"/>
-          <w:right w:val="single" w:sz="8" w:space="0" w:color="7F7F7F"/>
-        </w:tblBorders>
-      </w:tblPr>
-      <w:tblGrid>
-        <w:gridCol w:w="9000"/>
-      </w:tblGrid>
-      <w:tr>
-        <w:tc>
-          <w:tcPr>
-            <w:tcW w:w="9000" w:type="dxa"/>
-            <w:shd w:val="clear" w:color="auto" w:fill="EDEDED"/>
-          </w:tcPr>
-          <w:p>
-            <w:pPr>
-              <w:jc w:val="both"/>
-              <w:rPr>
-                <w:rFonts w:ascii="Times New Roman" w:hAnsi="Times New Roman" w:cs="Times New Roman"/>
-                <w:lang w:val="tr-TR"/>
-              </w:rPr>
-            </w:pPr>
-            <w:r>
-              <w:rPr>
-                <w:rFonts w:ascii="Times New Roman" w:hAnsi="Times New Roman" w:cs="Times New Roman"/>
-                <w:lang w:val="tr-TR"/>
-              </w:rPr>
-              <w:t xml:space="preserve">GÖRSEL ALANI (Shutterstock)</w:t>
-            </w:r>
-          </w:p>
-          <w:p>
-            <w:pPr>
-              <w:jc w:val="both"/>
-              <w:rPr>
-                <w:rFonts w:ascii="Times New Roman" w:hAnsi="Times New Roman" w:cs="Times New Roman"/>
-                <w:lang w:val="tr-TR"/>
-              </w:rPr>
-            </w:pPr>
-            <w:r>
-              <w:rPr>
-                <w:rFonts w:ascii="Times New Roman" w:hAnsi="Times New Roman" w:cs="Times New Roman"/>
-                <w:lang w:val="tr-TR"/>
-              </w:rPr>
-              <w:t xml:space="preserve">Tarif: Sıra sıra dizilmiş sunucu dolaplarının bulunduğu bir veri merkezi koridoru; tavanda soğutma boruları (marka/logo görünmesin).</w:t>
-            </w:r>
-          </w:p>
-          <w:p>
-            <w:pPr>
-              <w:jc w:val="both"/>
-              <w:rPr>
-                <w:rFonts w:ascii="Times New Roman" w:hAnsi="Times New Roman" w:cs="Times New Roman"/>
-                <w:lang w:val="tr-TR"/>
-              </w:rPr>
-            </w:pPr>
-            <w:r>
-              <w:rPr>
-                <w:rFonts w:ascii="Times New Roman" w:hAnsi="Times New Roman" w:cs="Times New Roman"/>
-                <w:lang w:val="tr-TR"/>
-              </w:rPr>
-              <w:t xml:space="preserve">Shutter ID: 2655026457 (fotoğraf) — Server rack cooling fans in a data center</w:t>
-            </w:r>
-          </w:p>
-        </w:tc>
-      </w:tr>
-    </w:tbl>
-    <w:p>
-      <w:pPr>
-        <w:jc w:val="both"/>
-        <w:rPr>
-          <w:rFonts w:ascii="Times New Roman" w:hAnsi="Times New Roman" w:cs="Times New Roman"/>
-          <w:lang w:val="tr-TR"/>
-        </w:rPr>
-      </w:pPr>
+      </w:pPr>
+      <w:r>
+        <w:drawing>
+          <wp:inline xmlns:a="http://schemas.openxmlformats.org/drawingml/2006/main" xmlns:pic="http://schemas.openxmlformats.org/drawingml/2006/picture">
+            <wp:extent cx="3436363" cy="2520000"/>
+            <wp:docPr id="900010" name="Picture 900010"/>
+            <wp:cNvGraphicFramePr>
+              <a:graphicFrameLocks noChangeAspect="1"/>
+            </wp:cNvGraphicFramePr>
+            <a:graphic>
+              <a:graphicData uri="http://schemas.openxmlformats.org/drawingml/2006/picture">
+                <pic:pic>
+                  <pic:nvPicPr>
+                    <pic:cNvPr id="0" name="2655026457_d.jpg"/>
+                    <pic:cNvPicPr/>
+                  </pic:nvPicPr>
+                  <pic:blipFill>
+                    <a:blip r:embed="rId12"/>
+                    <a:stretch>
+                      <a:fillRect/>
+                    </a:stretch>
+                  </pic:blipFill>
+                  <pic:spPr>
+                    <a:xfrm>
+                      <a:off x="0" y="0"/>
+                      <a:ext cx="3436363" cy="2520000"/>
+                    </a:xfrm>
+                    <a:prstGeom prst="rect"/>
+                  </pic:spPr>
+                </pic:pic>
+              </a:graphicData>
+            </a:graphic>
+          </wp:inline>
+        </w:drawing>
+      </w:r>
+    </w:p>
+    <w:p>
+      <w:pPr>
+        <w:jc w:val="center"/>
+      </w:pPr>
+      <w:r>
+        <w:rPr>
+          <w:rFonts w:ascii="Times New Roman" w:hAnsi="Times New Roman" w:cs="Times New Roman"/>
+          <w:b/>
+          <w:bCs/>
+          <w:highlight w:val="yellow"/>
+          <w:lang w:val="tr-TR"/>
+        </w:rPr>
+        <w:t xml:space="preserve">Shutter id: 2655026457</w:t>
+      </w:r>
     </w:p>
     <w:p>
       <w:pPr>

</xml_diff>

<commit_message>
3.3 Gorsel A: sesli asistan kullanan kisi fotografi degistirildi (Shutter 2040223691)
</commit_message>
<xml_diff>
--- a/Kim12-3-3-Yapay-Zeka-ve-Surdurulebilirlik.docx
+++ b/Kim12-3-3-Yapay-Zeka-ve-Surdurulebilirlik.docx
@@ -46,7 +46,7 @@
       <w:r>
         <w:drawing>
           <wp:inline xmlns:a="http://schemas.openxmlformats.org/drawingml/2006/main" xmlns:pic="http://schemas.openxmlformats.org/drawingml/2006/picture">
-            <wp:extent cx="3430127" cy="2520000"/>
+            <wp:extent cx="3430127" cy="2517713"/>
             <wp:docPr id="900009" name="Picture 900009"/>
             <wp:cNvGraphicFramePr>
               <a:graphicFrameLocks noChangeAspect="1"/>
@@ -67,7 +67,7 @@
                   <pic:spPr>
                     <a:xfrm>
                       <a:off x="0" y="0"/>
-                      <a:ext cx="3430127" cy="2520000"/>
+                      <a:ext cx="3430127" cy="2517713"/>
                     </a:xfrm>
                     <a:prstGeom prst="rect"/>
                   </pic:spPr>
@@ -90,7 +90,7 @@
           <w:highlight w:val="yellow"/>
           <w:lang w:val="tr-TR"/>
         </w:rPr>
-        <w:t xml:space="preserve">Shutter id: 2843947897</w:t>
+        <w:t xml:space="preserve">Shutter id: 2040223691</w:t>
       </w:r>
     </w:p>
     <w:p>

</xml_diff>